<commit_message>
Lomba Inovasi Tarakan: fitur Oktober masuk proposal; surat usulan Sekda TTE
- Unsur kebaruan bertambah: persetujuan eksplisit atas Kebijakan Privasi
  pada formulir publik (UU 27/2022) dan pencatatan status pesan WhatsApp
  beserta kirim ulang. Tahapan Oktober 2026 memuat masuk tanpa kata sandi,
  zona waktu WIB/WITA/WIT, pemantauan WhatsApp, Kebijakan Privasi, dan
  peladen di Singapura. Mitigasi risiko data pribadi dan Isian RISDA ikut
  diperbarui. Angka statistik tetap per 5 Oktober 2026.
- Surat usulan Sekda Nomor 500.10.30.2/1173/SETDA/2026 tanggal 9 Oktober
  2026 (TTE) tersisip sebagai Lampiran 2.
- Proposal 18 halaman isi (batas 20).

Co-Authored-By: Claude Opus 5.5 <noreply@anthropic.com>
Claude-Session: https://claude.ai/code/session_01TchDZWsQsgeuq52sKmozd1
</commit_message>
<xml_diff>
--- a/docs/lomba/tarakan/Proposal-Tarakan-Prokopim-Hibot-tanpa-Lampiran.docx
+++ b/docs/lomba/tarakan/Proposal-Tarakan-Prokopim-Hibot-tanpa-Lampiran.docx
@@ -709,7 +709,7 @@
           <w:sz w:val="20"/>
           <w:szCs w:val="20"/>
         </w:rPr>
-        <w:t xml:space="preserve">6.5 Perbedaan dari Cara Lama dan Solusi Sejenis	9</w:t>
+        <w:t xml:space="preserve">6.5 Perbedaan dari Cara Lama dan Solusi Sejenis	10</w:t>
       </w:r>
     </w:p>
     <w:p>
@@ -994,7 +994,7 @@
           <w:sz w:val="20"/>
           <w:szCs w:val="20"/>
         </w:rPr>
-        <w:t xml:space="preserve">9.4 Mutu Layanan dan Akuntabilitas	14</w:t>
+        <w:t xml:space="preserve">9.4 Mutu Layanan dan Akuntabilitas	15</w:t>
       </w:r>
     </w:p>
     <w:p>
@@ -1070,7 +1070,7 @@
           <w:sz w:val="20"/>
           <w:szCs w:val="20"/>
         </w:rPr>
-        <w:t xml:space="preserve">9.8 Kepuasan Pengguna	15</w:t>
+        <w:t xml:space="preserve">9.8 Kepuasan Pengguna	16</w:t>
       </w:r>
     </w:p>
     <w:p>
@@ -1108,7 +1108,7 @@
           <w:sz w:val="20"/>
           <w:szCs w:val="20"/>
         </w:rPr>
-        <w:t xml:space="preserve">10.1 Rencana Pengembangan	16</w:t>
+        <w:t xml:space="preserve">10.1 Rencana Pengembangan	17</w:t>
       </w:r>
     </w:p>
     <w:p>
@@ -1184,7 +1184,7 @@
           <w:sz w:val="20"/>
           <w:szCs w:val="20"/>
         </w:rPr>
-        <w:t xml:space="preserve">11.2 Syarat Replikasi	17</w:t>
+        <w:t xml:space="preserve">11.2 Syarat Replikasi	18</w:t>
       </w:r>
     </w:p>
     <w:p>
@@ -1203,7 +1203,7 @@
           <w:sz w:val="20"/>
           <w:szCs w:val="20"/>
         </w:rPr>
-        <w:t xml:space="preserve">11.3 Dokumentasi Pengetahuan	17</w:t>
+        <w:t xml:space="preserve">11.3 Dokumentasi Pengetahuan	18</w:t>
       </w:r>
     </w:p>
     <w:p>
@@ -1222,7 +1222,7 @@
           <w:sz w:val="20"/>
           <w:szCs w:val="20"/>
         </w:rPr>
-        <w:t xml:space="preserve">11.4 Diseminasi dan Publikasi	17</w:t>
+        <w:t xml:space="preserve">11.4 Diseminasi dan Publikasi	18</w:t>
       </w:r>
     </w:p>
     <w:p>
@@ -7864,7 +7864,7 @@
                 <w:sz w:val="20"/>
                 <w:szCs w:val="20"/>
               </w:rPr>
-              <w:t xml:space="preserve">Permohonan daring berjenjang; otomatis menjadi agenda bila disetujui</w:t>
+              <w:t xml:space="preserve">Permohonan daring berjenjang dengan pemberitahuan bertahap yang tidak membebani Pimpinan; otomatis menjadi agenda bila disetujui</w:t>
             </w:r>
           </w:p>
         </w:tc>
@@ -8951,6 +8951,64 @@
           <w:szCs w:val="22"/>
         </w:rPr>
         <w:t xml:space="preserve"> Generator undangan menghasilkan PDF berhuruf Arial yang langsung dapat diunggah ke Srikandi; letak kode QR tanda tangan elektronik telah disesuaikan, dan ruang rapat Imbaya atau Kenawai dapat diperiksa ketersediaannya serta dipesan sekaligus dari formulir yang sama.</w:t>
+      </w:r>
+    </w:p>
+    <w:p>
+      <w:pPr>
+        <w:pStyle w:val="ListParagraph"/>
+        <w:numPr>
+          <w:ilvl w:val="0"/>
+          <w:numId w:val="5"/>
+        </w:numPr>
+        <w:spacing w:after="60" w:line="276" w:lineRule="auto"/>
+        <w:jc w:val="both"/>
+      </w:pPr>
+      <w:r>
+        <w:rPr>
+          <w:rFonts w:ascii="Arial" w:cs="Arial" w:eastAsia="Arial" w:hAnsi="Arial"/>
+          <w:b/>
+          <w:bCs/>
+          <w:sz w:val="22"/>
+          <w:szCs w:val="22"/>
+        </w:rPr>
+        <w:t xml:space="preserve">Pelindungan data pribadi sejak formulir.</w:t>
+      </w:r>
+      <w:r>
+        <w:rPr>
+          <w:rFonts w:ascii="Arial" w:cs="Arial" w:eastAsia="Arial" w:hAnsi="Arial"/>
+          <w:sz w:val="22"/>
+          <w:szCs w:val="22"/>
+        </w:rPr>
+        <w:t xml:space="preserve"> Formulir audiensi dan peminjaman ruangan mensyaratkan persetujuan eksplisit atas Kebijakan Privasi dan Ketentuan Penggunaan sesuai Undang-Undang Nomor 27 Tahun 2022; waktu persetujuan dan versi kebijakan dicatat sebagai bukti, dan peladen menolak pengajuan tanpa persetujuan.</w:t>
+      </w:r>
+    </w:p>
+    <w:p>
+      <w:pPr>
+        <w:pStyle w:val="ListParagraph"/>
+        <w:numPr>
+          <w:ilvl w:val="0"/>
+          <w:numId w:val="5"/>
+        </w:numPr>
+        <w:spacing w:after="60" w:line="276" w:lineRule="auto"/>
+        <w:jc w:val="both"/>
+      </w:pPr>
+      <w:r>
+        <w:rPr>
+          <w:rFonts w:ascii="Arial" w:cs="Arial" w:eastAsia="Arial" w:hAnsi="Arial"/>
+          <w:b/>
+          <w:bCs/>
+          <w:sz w:val="22"/>
+          <w:szCs w:val="22"/>
+        </w:rPr>
+        <w:t xml:space="preserve">Pengiriman WhatsApp yang dapat diperiksa.</w:t>
+      </w:r>
+      <w:r>
+        <w:rPr>
+          <w:rFonts w:ascii="Arial" w:cs="Arial" w:eastAsia="Arial" w:hAnsi="Arial"/>
+          <w:sz w:val="22"/>
+          <w:szCs w:val="22"/>
+        </w:rPr>
+        <w:t xml:space="preserve"> Setiap pesan WhatsApp yang dikirim aplikasi tercatat beserta status terkirimnya, pemakaian kuota terpantau, dan pesan yang gagal karena perangkat gerbang pesan terputus dapat dikirim ulang sekaligus.</w:t>
       </w:r>
     </w:p>
     <w:p>
@@ -12006,7 +12064,7 @@
                 <w:sz w:val="20"/>
                 <w:szCs w:val="20"/>
               </w:rPr>
-              <w:t xml:space="preserve">Generator undangan siap tanda tangan elektronik Srikandi; pemesanan ruang rapat Imbaya dan Kenawai langsung dari formulir undangan; pratinjau undangan pada telepon pintar</w:t>
+              <w:t xml:space="preserve">Generator undangan siap tanda tangan elektronik Srikandi dengan pemesanan ruang rapat Imbaya dan Kenawai; masuk tanpa kata sandi (sidik jari atau Face ID, dan akun Google); pemantauan dan kirim ulang pesan WhatsApp; zona waktu WIB, WITA, dan WIT untuk perjalanan dinas; Kebijakan Privasi dan Ketentuan Penggunaan dengan persetujuan eksplisit pada formulir publik; peladen dipindahkan ke Singapura agar lebih cepat diakses</w:t>
             </w:r>
           </w:p>
         </w:tc>
@@ -12029,7 +12087,7 @@
           <w:sz w:val="22"/>
           <w:szCs w:val="22"/>
         </w:rPr>
-        <w:t xml:space="preserve">Sepanjang Maret sampai awal Oktober 2026 tercatat lebih dari 580 pembaruan aplikasi dalam lebih dari 90 hari pengembangan. Sebagian besar pembaruan berangkat dari kendala yang dilaporkan pengguna, sehingga aplikasi berkembang mengikuti kebutuhan nyata.</w:t>
+        <w:t xml:space="preserve">Sepanjang Maret sampai awal Oktober 2026 tercatat lebih dari 140 pembaruan aplikasi dalam lebih dari 30 hari pengembangan. Sebagian besar pembaruan berangkat dari kendala yang dilaporkan pengguna, sehingga aplikasi berkembang mengikuti kebutuhan nyata.</w:t>
       </w:r>
     </w:p>
     <w:p>
@@ -16979,7 +17037,7 @@
                 <w:sz w:val="20"/>
                 <w:szCs w:val="20"/>
               </w:rPr>
-              <w:t xml:space="preserve">Pembaruan berkelanjutan berdasarkan masukan pengguna; lebih dari 580 pembaruan sejak Maret 2026</w:t>
+              <w:t xml:space="preserve">Pembaruan berkelanjutan berdasarkan masukan pengguna; lebih dari 140 pembaruan sejak Maret 2026</w:t>
             </w:r>
           </w:p>
         </w:tc>
@@ -17933,7 +17991,7 @@
                 <w:sz w:val="20"/>
                 <w:szCs w:val="20"/>
               </w:rPr>
-              <w:t xml:space="preserve">Kanal publik tidak menampilkan identitas maupun kontak pemohon; penelusuran menuntut kode lengkap; pengetatan kebijakan akses basis data berjalan bertahap</w:t>
+              <w:t xml:space="preserve">Kebijakan Privasi dan persetujuan eksplisit pemohon (UU 27/2022); kanal publik tidak menampilkan identitas maupun kontak pemohon; penelusuran menuntut kode lengkap; pengetatan kebijakan akses basis data berjalan bertahap</w:t>
             </w:r>
           </w:p>
         </w:tc>

</xml_diff>

<commit_message>
Lomba Inovasi Tarakan: potensi replikasi diperluas ke seluruh pemerintah daerah
Bagian 10.1, 11.1, dan Isian RISDA kini menyebut replikasi oleh seluruh
pemerintah daerah di Indonesia (provinsi dan kabupaten/kota), dimulai
dari Kalimantan Utara. Halaman isi 19 (batas 20).

Co-Authored-By: Claude Opus 5.5 <noreply@anthropic.com>
Claude-Session: https://claude.ai/code/session_01TchDZWsQsgeuq52sKmozd1
</commit_message>
<xml_diff>
--- a/docs/lomba/tarakan/Proposal-Tarakan-Prokopim-Hibot-tanpa-Lampiran.docx
+++ b/docs/lomba/tarakan/Proposal-Tarakan-Prokopim-Hibot-tanpa-Lampiran.docx
@@ -17584,7 +17584,7 @@
                 <w:sz w:val="20"/>
                 <w:szCs w:val="20"/>
               </w:rPr>
-              <w:t xml:space="preserve">Paket replikasi bagi perangkat daerah di lingkungan Pemerintah Kota Tarakan dan pemerintah daerah lain di Kalimantan Utara (Bagian 11)</w:t>
+              <w:t xml:space="preserve">Paket replikasi bagi perangkat daerah di lingkungan Pemerintah Kota Tarakan dan pemerintah daerah lain di seluruh Indonesia, dimulai dari Kalimantan Utara (Bagian 11)</w:t>
             </w:r>
           </w:p>
         </w:tc>
@@ -18126,7 +18126,7 @@
           <w:sz w:val="22"/>
           <w:szCs w:val="22"/>
         </w:rPr>
-        <w:t xml:space="preserve">, Prokopim Hibot dapat direplikasi utuh maupun per modul. Di lingkungan Pemerintah Kota Tarakan, Sekretariat DPRD dapat mengadopsi alur penetapan agenda untuk pimpinan dewan, sedangkan modul peminjaman ruangan, permohonan audiensi, dan daftar hadir digital dapat dipakai perangkat daerah yang mengelola ruang pertemuan atau menerima tamu. Di luar Kota Tarakan, tugas keprotokolan dan komunikasi pimpinan dijalankan oleh setiap pemerintah daerah, termasuk Pemerintah Provinsi Kalimantan Utara serta Kabupaten Bulungan, Malinau, Nunukan, dan Tana Tidung. Yang perlu disesuaikan hanya nama jabatan, daftar pengguna, dan tata naskah dinas setempat.</w:t>
+        <w:t xml:space="preserve">, Prokopim Hibot dapat direplikasi utuh maupun per modul. Di lingkungan Pemerintah Kota Tarakan, Sekretariat DPRD dapat mengadopsi alur penetapan agenda untuk pimpinan dewan, sedangkan modul peminjaman ruangan, permohonan audiensi, dan daftar hadir digital dapat dipakai perangkat daerah yang mengelola ruang pertemuan atau menerima tamu. Di luar Kota Tarakan, tugas keprotokolan dan komunikasi pimpinan dijalankan oleh setiap pemerintah daerah di Indonesia, baik pemerintah provinsi maupun pemerintah kabupaten/kota, sehingga inovasi ini dapat direplikasi oleh seluruh pemerintah daerah. Langkah terdekat adalah Pemerintah Provinsi Kalimantan Utara serta Kabupaten Bulungan, Malinau, Nunukan, dan Tana Tidung. Yang perlu disesuaikan hanya nama jabatan, daftar pengguna, dan tata naskah dinas setempat.</w:t>
       </w:r>
     </w:p>
     <w:p>

</xml_diff>